<commit_message>
Add US relocation availability, rename Detect role to Jr PM/Coordinator, fix EV project tool to Tableau
</commit_message>
<xml_diff>
--- a/resume.docx
+++ b/resume.docx
@@ -52,9 +52,9 @@
           <w:sz w:val="20"/>
           <w:szCs w:val="20"/>
         </w:rPr>
-        <w:t xml:space="preserve">Houston, TX  |  +1 401 903 2586  |  </w:t>
-      </w:r>
-      <w:hyperlink w:history="1" r:id="rIdig-8wds-gr96jkxp8zsa-">
+        <w:t xml:space="preserve">Houston, TX  ·  open to relocation across the US  |  +1 401 903 2586  |  </w:t>
+      </w:r>
+      <w:hyperlink w:history="1" r:id="rIdnjlvlo2b5xo0v-b2wggt9">
         <w:r>
           <w:rPr>
             <w:rStyle w:val="Hyperlink"/>
@@ -76,7 +76,7 @@
         <w:spacing w:after="160"/>
         <w:jc w:val="center"/>
       </w:pPr>
-      <w:hyperlink w:history="1" r:id="rIdzwvybap3xnlkzhxd_brxd">
+      <w:hyperlink w:history="1" r:id="rIdh2s2htnmzfgcnjgkvdoud">
         <w:r>
           <w:rPr>
             <w:rStyle w:val="Hyperlink"/>
@@ -102,7 +102,7 @@
         </w:rPr>
         <w:t xml:space="preserve">   |   </w:t>
       </w:r>
-      <w:hyperlink w:history="1" r:id="rIdjsrqdzao5z1seoao2q8zj">
+      <w:hyperlink w:history="1" r:id="rIdjagfgmq2336k-doy6yhca">
         <w:r>
           <w:rPr>
             <w:rStyle w:val="Hyperlink"/>
@@ -128,7 +128,7 @@
         </w:rPr>
         <w:t xml:space="preserve">   |   </w:t>
       </w:r>
-      <w:hyperlink w:history="1" r:id="rIdwff25ujyj2pf4qtyu5m29">
+      <w:hyperlink w:history="1" r:id="rIdeyshetl2-q5_t0kcycy3b">
         <w:r>
           <w:rPr>
             <w:rStyle w:val="Hyperlink"/>
@@ -176,7 +176,7 @@
           <w:sz w:val="20"/>
           <w:szCs w:val="20"/>
         </w:rPr>
-        <w:t xml:space="preserve">Product Analyst with 3+ years across healthcare and industrial technology, turning operational data into Power BI dashboards and JIRA-driven delivery for clinical and engineering teams. Cut reporting turnaround 20%, onboarded 500+ enterprise clients, and dropped recurring production incidents 30% as Technical PM at Detect Technologies.</w:t>
+        <w:t xml:space="preserve">Product Analyst with 3+ years across healthcare and industrial technology, turning operational data into Power BI dashboards and JIRA-driven delivery for clinical and engineering teams. Cut reporting turnaround 20%, onboarded 500+ enterprise clients, and dropped recurring production incidents 30% as Jr Product Manager / Coordinator at Detect Technologies.</w:t>
       </w:r>
     </w:p>
     <w:p>
@@ -483,7 +483,7 @@
           <w:sz w:val="22"/>
           <w:szCs w:val="22"/>
         </w:rPr>
-        <w:t xml:space="preserve">Technical Project Manager / Product Coordinator</w:t>
+        <w:t xml:space="preserve">Jr Product Manager / Coordinator</w:t>
       </w:r>
       <w:r>
         <w:rPr>
@@ -1476,7 +1476,7 @@
           <w:sz w:val="18"/>
           <w:szCs w:val="18"/>
         </w:rPr>
-        <w:t xml:space="preserve">  —  Python · Power BI · Excel</w:t>
+        <w:t xml:space="preserve">  —  Python · Tableau · Excel</w:t>
       </w:r>
     </w:p>
     <w:p>
@@ -1499,7 +1499,7 @@
           <w:sz w:val="20"/>
           <w:szCs w:val="20"/>
         </w:rPr>
-        <w:t xml:space="preserve">Analyzed lifetime emission datasets across electric and gas vehicles and built interactive Excel and Power BI dashboards delivering sustainability insights for stakeholder presentations and coursework.</w:t>
+        <w:t xml:space="preserve">Analyzed lifetime emission datasets across electric and gas vehicles and built interactive Excel and Tableau dashboards delivering sustainability insights for stakeholder presentations and coursework.</w:t>
       </w:r>
     </w:p>
     <w:p>

</xml_diff>

<commit_message>
Remove relocation availability tag from hero and resume contact line
</commit_message>
<xml_diff>
--- a/resume.docx
+++ b/resume.docx
@@ -52,9 +52,9 @@
           <w:sz w:val="20"/>
           <w:szCs w:val="20"/>
         </w:rPr>
-        <w:t xml:space="preserve">Houston, TX  ·  open to relocation across the US  |  +1 401 903 2586  |  </w:t>
-      </w:r>
-      <w:hyperlink w:history="1" r:id="rIdnjlvlo2b5xo0v-b2wggt9">
+        <w:t xml:space="preserve">Houston, TX  |  +1 401 903 2586  |  </w:t>
+      </w:r>
+      <w:hyperlink w:history="1" r:id="rIduhaf56gylk61okxy6mz2m">
         <w:r>
           <w:rPr>
             <w:rStyle w:val="Hyperlink"/>
@@ -76,7 +76,7 @@
         <w:spacing w:after="160"/>
         <w:jc w:val="center"/>
       </w:pPr>
-      <w:hyperlink w:history="1" r:id="rIdh2s2htnmzfgcnjgkvdoud">
+      <w:hyperlink w:history="1" r:id="rIdcf8msvqizhgew-tqym5ml">
         <w:r>
           <w:rPr>
             <w:rStyle w:val="Hyperlink"/>
@@ -102,7 +102,7 @@
         </w:rPr>
         <w:t xml:space="preserve">   |   </w:t>
       </w:r>
-      <w:hyperlink w:history="1" r:id="rIdjagfgmq2336k-doy6yhca">
+      <w:hyperlink w:history="1" r:id="rIdobfmtyd4s4innc7twh8up">
         <w:r>
           <w:rPr>
             <w:rStyle w:val="Hyperlink"/>
@@ -128,7 +128,7 @@
         </w:rPr>
         <w:t xml:space="preserve">   |   </w:t>
       </w:r>
-      <w:hyperlink w:history="1" r:id="rIdeyshetl2-q5_t0kcycy3b">
+      <w:hyperlink w:history="1" r:id="rIdaxyo6qiuwa-1ayhwgh4hn">
         <w:r>
           <w:rPr>
             <w:rStyle w:val="Hyperlink"/>

</xml_diff>

<commit_message>
Add customer success role positioning
</commit_message>
<xml_diff>
--- a/resume.docx
+++ b/resume.docx
@@ -33,7 +33,7 @@
           <w:sz w:val="22"/>
           <w:szCs w:val="22"/>
         </w:rPr>
-        <w:t xml:space="preserve">Product Analyst  |  Associate Product Owner  |  Junior Technical Project Manager</w:t>
+        <w:t>Product Analyst  |  Customer Success Manager  |  Associate Product Owner  |  Junior TPM</w:t>
       </w:r>
     </w:p>
     <w:p>
@@ -176,7 +176,7 @@
           <w:sz w:val="20"/>
           <w:szCs w:val="20"/>
         </w:rPr>
-        <w:t xml:space="preserve">Product Analyst with 3+ years across healthcare and industrial technology, turning operational data into Power BI dashboards and JIRA-driven delivery for clinical and engineering teams. Cut reporting turnaround 20%, onboarded 500+ enterprise clients, and dropped recurring production incidents 30% as Jr Product Manager / Coordinator at Detect Technologies.</w:t>
+        <w:t>Product Analyst and customer-facing product professional with 3+ years across healthcare and industrial technology, turning operational data into Power BI dashboards, JIRA-driven delivery, and customer onboarding workflows. Cut reporting turnaround 20%, onboarded 500+ enterprise clients, and dropped recurring production incidents 30% as Jr Product Manager / Coordinator at Detect Technologies.</w:t>
       </w:r>
     </w:p>
     <w:p>
@@ -194,7 +194,7 @@
           <w:sz w:val="20"/>
           <w:szCs w:val="20"/>
         </w:rPr>
-        <w:t xml:space="preserve">Master’s in Management Information Systems (GPA 3.9, completed Oct 2025) focused on business intelligence, systems analysis, and process optimization. Comfortable working across product roadmapping, KPI frameworks, Agile/Scrum delivery, and HIPAA-aware healthcare data workflows.</w:t>
+        <w:t>Master’s in Management Information Systems (GPA 3.9, completed Oct 2025) focused on business intelligence, systems analysis, and process optimization. Comfortable working across product roadmapping, KPI frameworks, Agile/Scrum delivery, HIPAA-aware healthcare data workflows, and customer success enablement.</w:t>
       </w:r>
     </w:p>
     <w:p>
@@ -1016,6 +1016,26 @@
     </w:p>
     <w:p>
       <w:pPr>
+        <w:spacing w:after="20" w:line="240" w:lineRule="auto"/>
+      </w:pPr>
+      <w:r>
+        <w:rPr>
+          <w:rFonts w:ascii="Calibri" w:hAnsi="Calibri"/>
+          <w:b/>
+          <w:sz w:val="20"/>
+        </w:rPr>
+        <w:t xml:space="preserve">Customer Success:  </w:t>
+      </w:r>
+      <w:r>
+        <w:rPr>
+          <w:rFonts w:ascii="Calibri" w:hAnsi="Calibri"/>
+          <w:sz w:val="20"/>
+        </w:rPr>
+        <w:t>Client Onboarding · Adoption Metrics · Salesforce CRM · UAT Coordination · Technical Support Coordination · Customer Requirements · Stakeholder Follow-ups</w:t>
+      </w:r>
+    </w:p>
+    <w:p>
+      <w:pPr>
         <w:spacing w:after="20" w:line="240"/>
       </w:pPr>
       <w:r>
@@ -1091,20 +1111,19 @@
           <w:sz w:val="20"/>
           <w:szCs w:val="20"/>
         </w:rPr>
-        <w:t xml:space="preserve">Soft Skills:  </w:t>
-      </w:r>
-      <w:r>
-        <w:rPr>
-          <w:rFonts w:ascii="Calibri" w:cs="Calibri" w:eastAsia="Calibri" w:hAnsi="Calibri"/>
-          <w:b w:val="false"/>
-          <w:bCs w:val="false"/>
-          <w:i w:val="false"/>
-          <w:iCs w:val="false"/>
-          <w:color w:val="0B0B0C"/>
-          <w:sz w:val="20"/>
-          <w:szCs w:val="20"/>
-        </w:rPr>
-        <w:t xml:space="preserve">Executive Reporting · Cross-functional Collaboration · Problem Solving · Storytelling · Vendor Management</w:t>
+        <w:t>Soft Skills:  Executive Reporting · Cross-functional Collaboration · Customer Empathy · Problem Solving · Storytelling · Vendor Management</w:t>
+      </w:r>
+      <w:r>
+        <w:rPr>
+          <w:rFonts w:ascii="Calibri" w:cs="Calibri" w:eastAsia="Calibri" w:hAnsi="Calibri"/>
+          <w:b w:val="false"/>
+          <w:bCs w:val="false"/>
+          <w:i w:val="false"/>
+          <w:iCs w:val="false"/>
+          <w:color w:val="0B0B0C"/>
+          <w:sz w:val="20"/>
+          <w:szCs w:val="20"/>
+        </w:rPr>
       </w:r>
     </w:p>
     <w:p>

</xml_diff>